<commit_message>
docs(v6.0): actualizar materiales comerciales a v6.0
Sincroniza pitch, mockups, guiones y propuesta economica con v6.0:

- Elimina el encuadre 'sala movil / PWA / app instalable': la vista de
  sala es ahora responsive e integrada en el panel (dashboard/sala.html),
  se abre en cualquier navegador sin instalar nada.
- Refleja herramientas nuevas v6.0: disenador de plano de mesas,
  factura de servicio, QR de doble uso, panel superadmin y 3 roles.
- Actualiza todas las referencias de version a v6.0 (guiones, propuesta).

generate-propuesta.js: reframe de la fila de sala, +2 modulos nuevos
(factura de servicio, panel superadmin), total de mercado 14400->16800 EUR;
PROPUESTA-ECONOMICA.docx regenerado; README 10->12 capacidades.

VIDEO-PROMO-GUION-v1.md reescrito al motion comic real (2:18, 11 paneles).
</commit_message>
<xml_diff>
--- a/templates-comerciales/PROPUESTA-ECONOMICA.docx
+++ b/templates-comerciales/PROPUESTA-ECONOMICA.docx
@@ -707,7 +707,7 @@
                 <w:sz w:val="20"/>
                 <w:szCs w:val="20"/>
               </w:rPr>
-              <w:t xml:space="preserve">Login seguro, gestión multi-tenant de proyectos, métricas y agenda</w:t>
+              <w:t xml:space="preserve">Login seguro con 3 roles (superadmin, director, cliente), gestión multi-tenant de proyectos, métricas y agenda</w:t>
             </w:r>
           </w:p>
         </w:tc>
@@ -1193,7 +1193,7 @@
                 <w:sz w:val="20"/>
                 <w:szCs w:val="20"/>
               </w:rPr>
-              <w:t xml:space="preserve">Sala móvil (PWA)</w:t>
+              <w:t xml:space="preserve">Vista de sala + diseñador de plano</w:t>
             </w:r>
           </w:p>
         </w:tc>
@@ -1227,7 +1227,7 @@
                 <w:sz w:val="20"/>
                 <w:szCs w:val="20"/>
               </w:rPr>
-              <w:t xml:space="preserve">App instalable para el equipo de sala · eventos del día, dietas, ocupación</w:t>
+              <w:t xml:space="preserve">Vista responsive integrada en el panel (se abre en cualquier navegador, sin instalar nada) · eventos del día, dietas críticas, ocupación · diseñador de plano de mesas arrastrar y soltar</w:t>
             </w:r>
           </w:p>
         </w:tc>
@@ -1297,7 +1297,7 @@
                 <w:sz w:val="20"/>
                 <w:szCs w:val="20"/>
               </w:rPr>
-              <w:t xml:space="preserve">Carta digital pública + QR</w:t>
+              <w:t xml:space="preserve">Carta digital pública + QR de doble uso</w:t>
             </w:r>
           </w:p>
         </w:tc>
@@ -1331,7 +1331,7 @@
                 <w:sz w:val="20"/>
                 <w:szCs w:val="20"/>
               </w:rPr>
-              <w:t xml:space="preserve">Carta accesible por QR en mesa o flyer, con alérgenos y FAQ</w:t>
+              <w:t xml:space="preserve">Carta accesible por QR en mesa o flyer, con alérgenos y FAQ · el mismo QR sirve para carta y para evento</w:t>
             </w:r>
           </w:p>
         </w:tc>
@@ -1505,7 +1505,7 @@
                 <w:sz w:val="20"/>
                 <w:szCs w:val="20"/>
               </w:rPr>
-              <w:t xml:space="preserve">Asistente IA conversacional</w:t>
+              <w:t xml:space="preserve">Factura de servicio</w:t>
             </w:r>
           </w:p>
         </w:tc>
@@ -1539,7 +1539,7 @@
                 <w:sz w:val="20"/>
                 <w:szCs w:val="20"/>
               </w:rPr>
-              <w:t xml:space="preserve">Chat que ayuda al cliente final a configurar su menú · sin coste por uso</w:t>
+              <w:t xml:space="preserve">Generación de la factura del servicio del evento, lista para descargar y enviar</w:t>
             </w:r>
           </w:p>
         </w:tc>
@@ -1573,7 +1573,7 @@
                 <w:sz w:val="20"/>
                 <w:szCs w:val="20"/>
               </w:rPr>
-              <w:t xml:space="preserve">1 200 €</w:t>
+              <w:t xml:space="preserve">900 €</w:t>
             </w:r>
           </w:p>
         </w:tc>
@@ -1609,7 +1609,7 @@
                 <w:sz w:val="20"/>
                 <w:szCs w:val="20"/>
               </w:rPr>
-              <w:t xml:space="preserve">Importadores Excel/PDF/imágenes</w:t>
+              <w:t xml:space="preserve">Asistente IA conversacional</w:t>
             </w:r>
           </w:p>
         </w:tc>
@@ -1643,6 +1643,110 @@
                 <w:sz w:val="20"/>
                 <w:szCs w:val="20"/>
               </w:rPr>
+              <w:t xml:space="preserve">Chat que ayuda al cliente final a configurar su menú · sin coste por uso</w:t>
+            </w:r>
+          </w:p>
+        </w:tc>
+        <w:tc>
+          <w:tcPr>
+            <w:tcW w:type="dxa" w:w="1633"/>
+            <w:tcBorders>
+              <w:top w:val="single" w:color="cbd5e1" w:sz="6"/>
+              <w:left w:val="single" w:color="cbd5e1" w:sz="6"/>
+              <w:bottom w:val="single" w:color="cbd5e1" w:sz="6"/>
+              <w:right w:val="single" w:color="cbd5e1" w:sz="6"/>
+            </w:tcBorders>
+            <w:tcMar>
+              <w:top w:type="dxa" w:w="100"/>
+              <w:left w:type="dxa" w:w="140"/>
+              <w:bottom w:type="dxa" w:w="100"/>
+              <w:right w:type="dxa" w:w="140"/>
+            </w:tcMar>
+          </w:tcPr>
+          <w:p>
+            <w:pPr>
+              <w:spacing w:after="60" w:line="260"/>
+              <w:jc w:val="right"/>
+            </w:pPr>
+            <w:r>
+              <w:rPr>
+                <w:rFonts w:ascii="Calibri" w:cs="Calibri" w:eastAsia="Calibri" w:hAnsi="Calibri"/>
+                <w:b/>
+                <w:bCs/>
+                <w:color w:val="059669"/>
+                <w:sz w:val="20"/>
+                <w:szCs w:val="20"/>
+              </w:rPr>
+              <w:t xml:space="preserve">1 200 €</w:t>
+            </w:r>
+          </w:p>
+        </w:tc>
+      </w:tr>
+      <w:tr>
+        <w:tc>
+          <w:tcPr>
+            <w:tcW w:type="dxa" w:w="2903"/>
+            <w:tcBorders>
+              <w:top w:val="single" w:color="cbd5e1" w:sz="6"/>
+              <w:left w:val="single" w:color="cbd5e1" w:sz="6"/>
+              <w:bottom w:val="single" w:color="cbd5e1" w:sz="6"/>
+              <w:right w:val="single" w:color="cbd5e1" w:sz="6"/>
+            </w:tcBorders>
+            <w:tcMar>
+              <w:top w:type="dxa" w:w="100"/>
+              <w:left w:type="dxa" w:w="140"/>
+              <w:bottom w:type="dxa" w:w="100"/>
+              <w:right w:type="dxa" w:w="140"/>
+            </w:tcMar>
+          </w:tcPr>
+          <w:p>
+            <w:pPr>
+              <w:spacing w:after="60" w:line="260"/>
+              <w:jc w:val="left"/>
+            </w:pPr>
+            <w:r>
+              <w:rPr>
+                <w:rFonts w:ascii="Calibri" w:cs="Calibri" w:eastAsia="Calibri" w:hAnsi="Calibri"/>
+                <w:b/>
+                <w:bCs/>
+                <w:color w:val="0f172a"/>
+                <w:sz w:val="20"/>
+                <w:szCs w:val="20"/>
+              </w:rPr>
+              <w:t xml:space="preserve">Importadores Excel/PDF/imágenes</w:t>
+            </w:r>
+          </w:p>
+        </w:tc>
+        <w:tc>
+          <w:tcPr>
+            <w:tcW w:type="dxa" w:w="4536"/>
+            <w:tcBorders>
+              <w:top w:val="single" w:color="cbd5e1" w:sz="6"/>
+              <w:left w:val="single" w:color="cbd5e1" w:sz="6"/>
+              <w:bottom w:val="single" w:color="cbd5e1" w:sz="6"/>
+              <w:right w:val="single" w:color="cbd5e1" w:sz="6"/>
+            </w:tcBorders>
+            <w:tcMar>
+              <w:top w:type="dxa" w:w="100"/>
+              <w:left w:type="dxa" w:w="140"/>
+              <w:bottom w:type="dxa" w:w="100"/>
+              <w:right w:type="dxa" w:w="140"/>
+            </w:tcMar>
+          </w:tcPr>
+          <w:p>
+            <w:pPr>
+              <w:spacing w:after="60" w:line="260"/>
+              <w:jc w:val="left"/>
+            </w:pPr>
+            <w:r>
+              <w:rPr>
+                <w:rFonts w:ascii="Calibri" w:cs="Calibri" w:eastAsia="Calibri" w:hAnsi="Calibri"/>
+                <w:b w:val="false"/>
+                <w:bCs w:val="false"/>
+                <w:color w:val="1f2937"/>
+                <w:sz w:val="20"/>
+                <w:szCs w:val="20"/>
+              </w:rPr>
               <w:t xml:space="preserve">Migración de datos heredados con auto-matching y fallback de IA</w:t>
             </w:r>
           </w:p>
@@ -1678,6 +1782,110 @@
                 <w:szCs w:val="20"/>
               </w:rPr>
               <w:t xml:space="preserve">1 100 €</w:t>
+            </w:r>
+          </w:p>
+        </w:tc>
+      </w:tr>
+      <w:tr>
+        <w:tc>
+          <w:tcPr>
+            <w:tcW w:type="dxa" w:w="2903"/>
+            <w:tcBorders>
+              <w:top w:val="single" w:color="cbd5e1" w:sz="6"/>
+              <w:left w:val="single" w:color="cbd5e1" w:sz="6"/>
+              <w:bottom w:val="single" w:color="cbd5e1" w:sz="6"/>
+              <w:right w:val="single" w:color="cbd5e1" w:sz="6"/>
+            </w:tcBorders>
+            <w:tcMar>
+              <w:top w:type="dxa" w:w="100"/>
+              <w:left w:type="dxa" w:w="140"/>
+              <w:bottom w:type="dxa" w:w="100"/>
+              <w:right w:type="dxa" w:w="140"/>
+            </w:tcMar>
+          </w:tcPr>
+          <w:p>
+            <w:pPr>
+              <w:spacing w:after="60" w:line="260"/>
+              <w:jc w:val="left"/>
+            </w:pPr>
+            <w:r>
+              <w:rPr>
+                <w:rFonts w:ascii="Calibri" w:cs="Calibri" w:eastAsia="Calibri" w:hAnsi="Calibri"/>
+                <w:b/>
+                <w:bCs/>
+                <w:color w:val="0f172a"/>
+                <w:sz w:val="20"/>
+                <w:szCs w:val="20"/>
+              </w:rPr>
+              <w:t xml:space="preserve">Panel superadmin multi-establecimiento</w:t>
+            </w:r>
+          </w:p>
+        </w:tc>
+        <w:tc>
+          <w:tcPr>
+            <w:tcW w:type="dxa" w:w="4536"/>
+            <w:tcBorders>
+              <w:top w:val="single" w:color="cbd5e1" w:sz="6"/>
+              <w:left w:val="single" w:color="cbd5e1" w:sz="6"/>
+              <w:bottom w:val="single" w:color="cbd5e1" w:sz="6"/>
+              <w:right w:val="single" w:color="cbd5e1" w:sz="6"/>
+            </w:tcBorders>
+            <w:tcMar>
+              <w:top w:type="dxa" w:w="100"/>
+              <w:left w:type="dxa" w:w="140"/>
+              <w:bottom w:type="dxa" w:w="100"/>
+              <w:right w:type="dxa" w:w="140"/>
+            </w:tcMar>
+          </w:tcPr>
+          <w:p>
+            <w:pPr>
+              <w:spacing w:after="60" w:line="260"/>
+              <w:jc w:val="left"/>
+            </w:pPr>
+            <w:r>
+              <w:rPr>
+                <w:rFonts w:ascii="Calibri" w:cs="Calibri" w:eastAsia="Calibri" w:hAnsi="Calibri"/>
+                <w:b w:val="false"/>
+                <w:bCs w:val="false"/>
+                <w:color w:val="1f2937"/>
+                <w:sz w:val="20"/>
+                <w:szCs w:val="20"/>
+              </w:rPr>
+              <w:t xml:space="preserve">Vista agregada de KPIs de todos los establecimientos · facturación, ocupación y top paquetes con sparklines</w:t>
+            </w:r>
+          </w:p>
+        </w:tc>
+        <w:tc>
+          <w:tcPr>
+            <w:tcW w:type="dxa" w:w="1633"/>
+            <w:tcBorders>
+              <w:top w:val="single" w:color="cbd5e1" w:sz="6"/>
+              <w:left w:val="single" w:color="cbd5e1" w:sz="6"/>
+              <w:bottom w:val="single" w:color="cbd5e1" w:sz="6"/>
+              <w:right w:val="single" w:color="cbd5e1" w:sz="6"/>
+            </w:tcBorders>
+            <w:tcMar>
+              <w:top w:type="dxa" w:w="100"/>
+              <w:left w:type="dxa" w:w="140"/>
+              <w:bottom w:type="dxa" w:w="100"/>
+              <w:right w:type="dxa" w:w="140"/>
+            </w:tcMar>
+          </w:tcPr>
+          <w:p>
+            <w:pPr>
+              <w:spacing w:after="60" w:line="260"/>
+              <w:jc w:val="right"/>
+            </w:pPr>
+            <w:r>
+              <w:rPr>
+                <w:rFonts w:ascii="Calibri" w:cs="Calibri" w:eastAsia="Calibri" w:hAnsi="Calibri"/>
+                <w:b/>
+                <w:bCs/>
+                <w:color w:val="059669"/>
+                <w:sz w:val="20"/>
+                <w:szCs w:val="20"/>
+              </w:rPr>
+              <w:t xml:space="preserve">1 500 €</w:t>
             </w:r>
           </w:p>
         </w:tc>
@@ -1749,7 +1957,7 @@
                 <w:sz w:val="22"/>
                 <w:szCs w:val="22"/>
               </w:rPr>
-              <w:t xml:space="preserve">14 400 €</w:t>
+              <w:t xml:space="preserve">16 800 €</w:t>
             </w:r>
           </w:p>
         </w:tc>
@@ -3639,7 +3847,7 @@
         <w:sz w:val="16"/>
         <w:szCs w:val="16"/>
       </w:rPr>
-      <w:t xml:space="preserve">Plataforma F&amp;B · v5.6  ·  Francisco Javier Martínez Alba  ·  Página </w:t>
+      <w:t xml:space="preserve">Plataforma F&amp;B · v6.0  ·  Francisco Javier Martínez Alba  ·  Página </w:t>
     </w:r>
     <w:r>
       <w:rPr>

</xml_diff>